<commit_message>
Add NABC pitch section to business plan
Co-Authored-By: Claude Fable 5 <noreply@anthropic.com>
</commit_message>
<xml_diff>
--- a/K_helper_Business_Plan_2026.docx
+++ b/K_helper_Business_Plan_2026.docx
@@ -158,115 +158,7 @@
           <w:bCs/>
           <w:color w:val="D94E1F"/>
         </w:rPr>
-        <w:t xml:space="preserve">2. The Problem</w:t>
-      </w:r>
-    </w:p>
-    <w:p>
-      <w:pPr>
-        <w:spacing w:after="120"/>
-      </w:pPr>
-      <w:r>
-        <w:rPr>
-          <w:color w:val="333333"/>
-        </w:rPr>
-        <w:t xml:space="preserve">Korea's foreign population just passed 2.84 million (5.5% of the country) while support systems remain Korean-only. A Vietnamese factory worker with a contract dispute, a Cambodian farm worker reading a hospital bill, an Indonesian student confused by visa renewal — all face the same wall: government websites they cannot read, interpreters they cannot afford ($40–80/hr), and advice they cannot trust.</w:t>
-      </w:r>
-    </w:p>
-    <w:p>
-      <w:pPr>
-        <w:pStyle w:val="ListParagraph"/>
-        <w:numPr>
-          <w:ilvl w:val="0"/>
-          <w:numId w:val="2"/>
-        </w:numPr>
-        <w:spacing w:after="70"/>
-      </w:pPr>
-      <w:r>
-        <w:rPr>
-          <w:b/>
-          <w:bCs/>
-          <w:color w:val="333333"/>
-        </w:rPr>
-        <w:t xml:space="preserve">~398,000 undocumented residents </w:t>
-      </w:r>
-      <w:r>
-        <w:rPr>
-          <w:color w:val="333333"/>
-        </w:rPr>
-        <w:t xml:space="preserve">have no NHIS access at all (Ministry of Justice, 2024).</w:t>
-      </w:r>
-    </w:p>
-    <w:p>
-      <w:pPr>
-        <w:pStyle w:val="ListParagraph"/>
-        <w:numPr>
-          <w:ilvl w:val="0"/>
-          <w:numId w:val="2"/>
-        </w:numPr>
-        <w:spacing w:after="70"/>
-      </w:pPr>
-      <w:r>
-        <w:rPr>
-          <w:b/>
-          <w:bCs/>
-          <w:color w:val="333333"/>
-        </w:rPr>
-        <w:t xml:space="preserve">An estimated 400,000–600,000 foreigners are uninsured </w:t>
-      </w:r>
-      <w:r>
-        <w:rPr>
-          <w:color w:val="333333"/>
-        </w:rPr>
-        <w:t xml:space="preserve">overall.</w:t>
-      </w:r>
-    </w:p>
-    <w:p>
-      <w:pPr>
-        <w:pStyle w:val="ListParagraph"/>
-        <w:numPr>
-          <w:ilvl w:val="0"/>
-          <w:numId w:val="2"/>
-        </w:numPr>
-        <w:spacing w:after="70"/>
-      </w:pPr>
-      <w:r>
-        <w:rPr>
-          <w:b/>
-          <w:bCs/>
-          <w:color w:val="333333"/>
-        </w:rPr>
-        <w:t xml:space="preserve">Khmer and Bengali interpreter coverage: </w:t>
-      </w:r>
-      <w:r>
-        <w:rPr>
-          <w:color w:val="333333"/>
-        </w:rPr>
-        <w:t xml:space="preserve">under 10% of hospitals; fewer than 5 professional interpreters each.</w:t>
-      </w:r>
-    </w:p>
-    <w:p>
-      <w:pPr>
-        <w:pStyle w:val="Heading1"/>
-        <w:spacing w:after="140" w:before="320"/>
-      </w:pPr>
-      <w:r>
-        <w:rPr>
-          <w:b/>
-          <w:bCs/>
-          <w:color w:val="D94E1F"/>
-        </w:rPr>
-        <w:t xml:space="preserve">3. The Solution</w:t>
-      </w:r>
-    </w:p>
-    <w:p>
-      <w:pPr>
-        <w:spacing w:after="120"/>
-      </w:pPr>
-      <w:r>
-        <w:rPr>
-          <w:color w:val="333333"/>
-        </w:rPr>
-        <w:t xml:space="preserve">One conversation, any language. The user types a question; K'Helper answers clearly and honestly — including "that is illegal, here is what you can do" — with crisis detection, scam protection, and emergency contacts built in.</w:t>
+        <w:t xml:space="preserve">2. The Pitch (NABC)</w:t>
       </w:r>
     </w:p>
     <w:p>
@@ -282,71 +174,99 @@
           <w:sz w:val="24"/>
           <w:szCs w:val="24"/>
         </w:rPr>
-        <w:t xml:space="preserve">Shipped today</w:t>
-      </w:r>
-    </w:p>
-    <w:p>
-      <w:pPr>
-        <w:pStyle w:val="ListParagraph"/>
-        <w:numPr>
-          <w:ilvl w:val="0"/>
-          <w:numId w:val="2"/>
-        </w:numPr>
-        <w:spacing w:after="70"/>
-      </w:pPr>
-      <w:r>
-        <w:rPr>
-          <w:color w:val="333333"/>
-        </w:rPr>
-        <w:t xml:space="preserve">Chat assistant on Anthropic Claude with a 3-agent safety system (Guardian / Core / Sentinel), rate limiting, and a server-side API key.</w:t>
-      </w:r>
-    </w:p>
-    <w:p>
-      <w:pPr>
-        <w:pStyle w:val="ListParagraph"/>
-        <w:numPr>
-          <w:ilvl w:val="0"/>
-          <w:numId w:val="2"/>
-        </w:numPr>
-        <w:spacing w:after="70"/>
-      </w:pPr>
-      <w:r>
-        <w:rPr>
-          <w:color w:val="333333"/>
-        </w:rPr>
-        <w:t xml:space="preserve">Google sign-in with a triple-fallback flow that works even on ad-blocked and filtered networks.</w:t>
-      </w:r>
-    </w:p>
-    <w:p>
-      <w:pPr>
-        <w:pStyle w:val="ListParagraph"/>
-        <w:numPr>
-          <w:ilvl w:val="0"/>
-          <w:numId w:val="2"/>
-        </w:numPr>
-        <w:spacing w:after="70"/>
-      </w:pPr>
-      <w:r>
-        <w:rPr>
-          <w:color w:val="333333"/>
-        </w:rPr>
-        <w:t xml:space="preserve">Visa expiry tracker, quick-topic shortcuts, locations map panel, Korean CV builder (이력서), and a translator marketplace.</w:t>
-      </w:r>
-    </w:p>
-    <w:p>
-      <w:pPr>
-        <w:pStyle w:val="ListParagraph"/>
-        <w:numPr>
-          <w:ilvl w:val="0"/>
-          <w:numId w:val="2"/>
-        </w:numPr>
-        <w:spacing w:after="70"/>
-      </w:pPr>
-      <w:r>
-        <w:rPr>
-          <w:color w:val="333333"/>
-        </w:rPr>
-        <w:t xml:space="preserve">English-first UI with full Khmer and Korean localization; chat answers in any language automatically.</w:t>
+        <w:t xml:space="preserve">Need</w:t>
+      </w:r>
+    </w:p>
+    <w:p>
+      <w:pPr>
+        <w:spacing w:after="120"/>
+      </w:pPr>
+      <w:r>
+        <w:rPr>
+          <w:color w:val="333333"/>
+        </w:rPr>
+        <w:t xml:space="preserve">2.84 million foreigners live in Korea, but immigration, hospitals, and labor systems speak only Korean. ~398,000 undocumented residents have no insurance access; 400,000–600,000 are uninsured overall. For Khmer or Bengali speakers, fewer than 5 professional medical interpreters exist nationwide, at $60–80/hr they cannot afford. The need is urgent and recurring — every visa renewal, every hospital visit, every contract.</w:t>
+      </w:r>
+    </w:p>
+    <w:p>
+      <w:pPr>
+        <w:pStyle w:val="Heading2"/>
+        <w:spacing w:after="100" w:before="220"/>
+      </w:pPr>
+      <w:r>
+        <w:rPr>
+          <w:b/>
+          <w:bCs/>
+          <w:color w:val="8F2E10"/>
+          <w:sz w:val="24"/>
+          <w:szCs w:val="24"/>
+        </w:rPr>
+        <w:t xml:space="preserve">Approach</w:t>
+      </w:r>
+    </w:p>
+    <w:p>
+      <w:pPr>
+        <w:spacing w:after="120"/>
+      </w:pPr>
+      <w:r>
+        <w:rPr>
+          <w:color w:val="333333"/>
+        </w:rPr>
+        <w:t xml:space="preserve">A free, Claude-powered AI assistant at khelper.org — installable PWA, no app store, runs on old Android phones. Ask in any language; get a clear, honest answer on visas, work rights, healthcare, and housing in seconds. Built-in safety agents (crisis and scam detection), visa expiry tracking, Korean CV builder, translator marketplace. Distribution starts in the founder’s own Cambodian community, then expands tier by tier to all foreigners.</w:t>
+      </w:r>
+    </w:p>
+    <w:p>
+      <w:pPr>
+        <w:pStyle w:val="Heading2"/>
+        <w:spacing w:after="100" w:before="220"/>
+      </w:pPr>
+      <w:r>
+        <w:rPr>
+          <w:b/>
+          <w:bCs/>
+          <w:color w:val="8F2E10"/>
+          <w:sz w:val="24"/>
+          <w:szCs w:val="24"/>
+        </w:rPr>
+        <w:t xml:space="preserve">Benefit</w:t>
+      </w:r>
+    </w:p>
+    <w:p>
+      <w:pPr>
+        <w:spacing w:after="120"/>
+      </w:pPr>
+      <w:r>
+        <w:rPr>
+          <w:color w:val="333333"/>
+        </w:rPr>
+        <w:t xml:space="preserve">Users: answers in seconds instead of hours, free versus $40–80/hr interpreters — fewer missed visa deadlines, avoided scams, hospital visits no longer skipped. B2B: hospitals cut interpreter costs and no-shows; employers reduce E-9 turnover and disputes; government reaches populations it cannot serve today. Economics: near-zero cost to serve against a $300K–4.5M/yr consumer revenue range plus B2B contracts.</w:t>
+      </w:r>
+    </w:p>
+    <w:p>
+      <w:pPr>
+        <w:pStyle w:val="Heading2"/>
+        <w:spacing w:after="100" w:before="220"/>
+      </w:pPr>
+      <w:r>
+        <w:rPr>
+          <w:b/>
+          <w:bCs/>
+          <w:color w:val="8F2E10"/>
+          <w:sz w:val="24"/>
+          <w:szCs w:val="24"/>
+        </w:rPr>
+        <w:t xml:space="preserve">Competition</w:t>
+      </w:r>
+    </w:p>
+    <w:p>
+      <w:pPr>
+        <w:spacing w:after="120"/>
+      </w:pPr>
+      <w:r>
+        <w:rPr>
+          <w:color w:val="333333"/>
+        </w:rPr>
+        <w:t xml:space="preserve">Google Translate (unreliable for medical/legal nuance), hospital interpreters (5–10% coverage in the languages that matter most), professional interpreters (unaffordable), Korean-only telemedicine, and Facebook peer groups (trust without expertise). No one offers AI-powered, migrant-specific life navigation. The moat is community trust, migrant-specific depth, and a cost structure incumbents cannot match.</w:t>
       </w:r>
     </w:p>
     <w:p>
@@ -360,7 +280,209 @@
           <w:bCs/>
           <w:color w:val="D94E1F"/>
         </w:rPr>
-        <w:t xml:space="preserve">4. Market (verified July 2026)</w:t>
+        <w:t xml:space="preserve">3. The Problem</w:t>
+      </w:r>
+    </w:p>
+    <w:p>
+      <w:pPr>
+        <w:spacing w:after="120"/>
+      </w:pPr>
+      <w:r>
+        <w:rPr>
+          <w:color w:val="333333"/>
+        </w:rPr>
+        <w:t xml:space="preserve">Korea's foreign population just passed 2.84 million (5.5% of the country) while support systems remain Korean-only. A Vietnamese factory worker with a contract dispute, a Cambodian farm worker reading a hospital bill, an Indonesian student confused by visa renewal — all face the same wall: government websites they cannot read, interpreters they cannot afford ($40–80/hr), and advice they cannot trust.</w:t>
+      </w:r>
+    </w:p>
+    <w:p>
+      <w:pPr>
+        <w:pStyle w:val="ListParagraph"/>
+        <w:numPr>
+          <w:ilvl w:val="0"/>
+          <w:numId w:val="2"/>
+        </w:numPr>
+        <w:spacing w:after="70"/>
+      </w:pPr>
+      <w:r>
+        <w:rPr>
+          <w:b/>
+          <w:bCs/>
+          <w:color w:val="333333"/>
+        </w:rPr>
+        <w:t xml:space="preserve">~398,000 undocumented residents </w:t>
+      </w:r>
+      <w:r>
+        <w:rPr>
+          <w:color w:val="333333"/>
+        </w:rPr>
+        <w:t xml:space="preserve">have no NHIS access at all (Ministry of Justice, 2024).</w:t>
+      </w:r>
+    </w:p>
+    <w:p>
+      <w:pPr>
+        <w:pStyle w:val="ListParagraph"/>
+        <w:numPr>
+          <w:ilvl w:val="0"/>
+          <w:numId w:val="2"/>
+        </w:numPr>
+        <w:spacing w:after="70"/>
+      </w:pPr>
+      <w:r>
+        <w:rPr>
+          <w:b/>
+          <w:bCs/>
+          <w:color w:val="333333"/>
+        </w:rPr>
+        <w:t xml:space="preserve">An estimated 400,000–600,000 foreigners are uninsured </w:t>
+      </w:r>
+      <w:r>
+        <w:rPr>
+          <w:color w:val="333333"/>
+        </w:rPr>
+        <w:t xml:space="preserve">overall.</w:t>
+      </w:r>
+    </w:p>
+    <w:p>
+      <w:pPr>
+        <w:pStyle w:val="ListParagraph"/>
+        <w:numPr>
+          <w:ilvl w:val="0"/>
+          <w:numId w:val="2"/>
+        </w:numPr>
+        <w:spacing w:after="70"/>
+      </w:pPr>
+      <w:r>
+        <w:rPr>
+          <w:b/>
+          <w:bCs/>
+          <w:color w:val="333333"/>
+        </w:rPr>
+        <w:t xml:space="preserve">Khmer and Bengali interpreter coverage: </w:t>
+      </w:r>
+      <w:r>
+        <w:rPr>
+          <w:color w:val="333333"/>
+        </w:rPr>
+        <w:t xml:space="preserve">under 10% of hospitals; fewer than 5 professional interpreters each.</w:t>
+      </w:r>
+    </w:p>
+    <w:p>
+      <w:pPr>
+        <w:pStyle w:val="Heading1"/>
+        <w:spacing w:after="140" w:before="320"/>
+      </w:pPr>
+      <w:r>
+        <w:rPr>
+          <w:b/>
+          <w:bCs/>
+          <w:color w:val="D94E1F"/>
+        </w:rPr>
+        <w:t xml:space="preserve">4. The Solution</w:t>
+      </w:r>
+    </w:p>
+    <w:p>
+      <w:pPr>
+        <w:spacing w:after="120"/>
+      </w:pPr>
+      <w:r>
+        <w:rPr>
+          <w:color w:val="333333"/>
+        </w:rPr>
+        <w:t xml:space="preserve">One conversation, any language. The user types a question; K'Helper answers clearly and honestly — including "that is illegal, here is what you can do" — with crisis detection, scam protection, and emergency contacts built in.</w:t>
+      </w:r>
+    </w:p>
+    <w:p>
+      <w:pPr>
+        <w:pStyle w:val="Heading2"/>
+        <w:spacing w:after="100" w:before="220"/>
+      </w:pPr>
+      <w:r>
+        <w:rPr>
+          <w:b/>
+          <w:bCs/>
+          <w:color w:val="8F2E10"/>
+          <w:sz w:val="24"/>
+          <w:szCs w:val="24"/>
+        </w:rPr>
+        <w:t xml:space="preserve">Shipped today</w:t>
+      </w:r>
+    </w:p>
+    <w:p>
+      <w:pPr>
+        <w:pStyle w:val="ListParagraph"/>
+        <w:numPr>
+          <w:ilvl w:val="0"/>
+          <w:numId w:val="2"/>
+        </w:numPr>
+        <w:spacing w:after="70"/>
+      </w:pPr>
+      <w:r>
+        <w:rPr>
+          <w:color w:val="333333"/>
+        </w:rPr>
+        <w:t xml:space="preserve">Chat assistant on Anthropic Claude with a 3-agent safety system (Guardian / Core / Sentinel), rate limiting, and a server-side API key.</w:t>
+      </w:r>
+    </w:p>
+    <w:p>
+      <w:pPr>
+        <w:pStyle w:val="ListParagraph"/>
+        <w:numPr>
+          <w:ilvl w:val="0"/>
+          <w:numId w:val="2"/>
+        </w:numPr>
+        <w:spacing w:after="70"/>
+      </w:pPr>
+      <w:r>
+        <w:rPr>
+          <w:color w:val="333333"/>
+        </w:rPr>
+        <w:t xml:space="preserve">Google sign-in with a triple-fallback flow that works even on ad-blocked and filtered networks.</w:t>
+      </w:r>
+    </w:p>
+    <w:p>
+      <w:pPr>
+        <w:pStyle w:val="ListParagraph"/>
+        <w:numPr>
+          <w:ilvl w:val="0"/>
+          <w:numId w:val="2"/>
+        </w:numPr>
+        <w:spacing w:after="70"/>
+      </w:pPr>
+      <w:r>
+        <w:rPr>
+          <w:color w:val="333333"/>
+        </w:rPr>
+        <w:t xml:space="preserve">Visa expiry tracker, quick-topic shortcuts, locations map panel, Korean CV builder (이력서), and a translator marketplace.</w:t>
+      </w:r>
+    </w:p>
+    <w:p>
+      <w:pPr>
+        <w:pStyle w:val="ListParagraph"/>
+        <w:numPr>
+          <w:ilvl w:val="0"/>
+          <w:numId w:val="2"/>
+        </w:numPr>
+        <w:spacing w:after="70"/>
+      </w:pPr>
+      <w:r>
+        <w:rPr>
+          <w:color w:val="333333"/>
+        </w:rPr>
+        <w:t xml:space="preserve">English-first UI with full Khmer and Korean localization; chat answers in any language automatically.</w:t>
+      </w:r>
+    </w:p>
+    <w:p>
+      <w:pPr>
+        <w:pStyle w:val="Heading1"/>
+        <w:spacing w:after="140" w:before="320"/>
+      </w:pPr>
+      <w:r>
+        <w:rPr>
+          <w:b/>
+          <w:bCs/>
+          <w:color w:val="D94E1F"/>
+        </w:rPr>
+        <w:t xml:space="preserve">5. Market (verified July 2026)</w:t>
       </w:r>
     </w:p>
     <w:tbl>
@@ -816,7 +938,7 @@
           <w:bCs/>
           <w:color w:val="D94E1F"/>
         </w:rPr>
-        <w:t xml:space="preserve">5. Go-to-Market</w:t>
+        <w:t xml:space="preserve">6. Go-to-Market</w:t>
       </w:r>
     </w:p>
     <w:p>
@@ -1048,7 +1170,7 @@
           <w:bCs/>
           <w:color w:val="D94E1F"/>
         </w:rPr>
-        <w:t xml:space="preserve">6. Business Model</w:t>
+        <w:t xml:space="preserve">7. Business Model</w:t>
       </w:r>
     </w:p>
     <w:p>
@@ -1712,7 +1834,7 @@
           <w:bCs/>
           <w:color w:val="D94E1F"/>
         </w:rPr>
-        <w:t xml:space="preserve">7. Competition</w:t>
+        <w:t xml:space="preserve">8. Competition</w:t>
       </w:r>
     </w:p>
     <w:p>
@@ -1737,7 +1859,7 @@
           <w:bCs/>
           <w:color w:val="D94E1F"/>
         </w:rPr>
-        <w:t xml:space="preserve">8. Roadmap</w:t>
+        <w:t xml:space="preserve">9. Roadmap</w:t>
       </w:r>
     </w:p>
     <w:tbl>
@@ -2247,7 +2369,7 @@
           <w:bCs/>
           <w:color w:val="D94E1F"/>
         </w:rPr>
-        <w:t xml:space="preserve">9. Costs &amp; Runway</w:t>
+        <w:t xml:space="preserve">10. Costs &amp; Runway</w:t>
       </w:r>
     </w:p>
     <w:p>
@@ -2333,7 +2455,7 @@
           <w:bCs/>
           <w:color w:val="D94E1F"/>
         </w:rPr>
-        <w:t xml:space="preserve">10. Risks</w:t>
+        <w:t xml:space="preserve">11. Risks</w:t>
       </w:r>
     </w:p>
     <w:p>
@@ -2443,7 +2565,7 @@
           <w:bCs/>
           <w:color w:val="D94E1F"/>
         </w:rPr>
-        <w:t xml:space="preserve">11. Priorities Right Now</w:t>
+        <w:t xml:space="preserve">12. Priorities Right Now</w:t>
       </w:r>
     </w:p>
     <w:p>

</xml_diff>

<commit_message>
Add Find & Book Care marketplace: business plan section + booking mockup screen
Co-Authored-By: Claude Fable 5 <noreply@anthropic.com>
</commit_message>
<xml_diff>
--- a/K_helper_Business_Plan_2026.docx
+++ b/K_helper_Business_Plan_2026.docx
@@ -212,7 +212,7 @@
         <w:rPr>
           <w:color w:val="333333"/>
         </w:rPr>
-        <w:t xml:space="preserve">A free, Claude-powered AI assistant at khelper.org — installable PWA, no app store, runs on old Android phones. Ask in any language; get a clear, honest answer on visas, work rights, healthcare, and housing in seconds. Built-in safety agents (crisis and scam detection), visa expiry tracking, Korean CV builder, translator marketplace. Distribution starts in the founder’s own Cambodian community, then expands tier by tier to all foreigners.</w:t>
+        <w:t xml:space="preserve">A free, Claude-powered AI assistant at khelper.org — installable PWA, no app store, runs on old Android phones. Ask in any language; get a clear, honest answer on visas, work rights, healthcare, and housing in seconds. Built-in safety agents (crisis and scam detection), visa expiry tracking, and a find-and-book care marketplace connecting foreign patients to clinics. Distribution starts in the founder’s own Cambodian community, then expands tier by tier to all foreigners.</w:t>
       </w:r>
     </w:p>
     <w:p>
@@ -482,7 +482,211 @@
           <w:bCs/>
           <w:color w:val="D94E1F"/>
         </w:rPr>
-        <w:t xml:space="preserve">5. Market (verified July 2026)</w:t>
+        <w:t xml:space="preserve">5. Find &amp; Book Care — the Marketplace Layer</w:t>
+      </w:r>
+    </w:p>
+    <w:p>
+      <w:pPr>
+        <w:spacing w:after="120"/>
+      </w:pPr>
+      <w:r>
+        <w:rPr>
+          <w:color w:val="333333"/>
+        </w:rPr>
+        <w:t xml:space="preserve">Beyond answers, K’Helper closes the loop: find a clinic that will serve you, and book it — directly from the app, in your language.</w:t>
+      </w:r>
+    </w:p>
+    <w:p>
+      <w:pPr>
+        <w:pStyle w:val="Heading2"/>
+        <w:spacing w:after="100" w:before="220"/>
+      </w:pPr>
+      <w:r>
+        <w:rPr>
+          <w:b/>
+          <w:bCs/>
+          <w:color w:val="8F2E10"/>
+          <w:sz w:val="24"/>
+          <w:szCs w:val="24"/>
+        </w:rPr>
+        <w:t xml:space="preserve">The data problem is already solved</w:t>
+      </w:r>
+    </w:p>
+    <w:p>
+      <w:pPr>
+        <w:pStyle w:val="ListParagraph"/>
+        <w:numPr>
+          <w:ilvl w:val="0"/>
+          <w:numId w:val="2"/>
+        </w:numPr>
+        <w:spacing w:after="70"/>
+      </w:pPr>
+      <w:r>
+        <w:rPr>
+          <w:b/>
+          <w:bCs/>
+          <w:color w:val="333333"/>
+        </w:rPr>
+        <w:t xml:space="preserve">Directory: </w:t>
+      </w:r>
+      <w:r>
+        <w:rPr>
+          <w:color w:val="333333"/>
+        </w:rPr>
+        <w:t xml:space="preserve">Korea’s government publishes the complete national registry of hospitals and clinics (locations, types, specialties) as free open APIs via HIRA (opendata.hira.or.kr) and data.go.kr — no scraping, no permissions.</w:t>
+      </w:r>
+    </w:p>
+    <w:p>
+      <w:pPr>
+        <w:pStyle w:val="ListParagraph"/>
+        <w:numPr>
+          <w:ilvl w:val="0"/>
+          <w:numId w:val="2"/>
+        </w:numPr>
+        <w:spacing w:after="70"/>
+      </w:pPr>
+      <w:r>
+        <w:rPr>
+          <w:b/>
+          <w:bCs/>
+          <w:color w:val="333333"/>
+        </w:rPr>
+        <w:t xml:space="preserve">Maps: </w:t>
+      </w:r>
+      <w:r>
+        <w:rPr>
+          <w:color w:val="333333"/>
+        </w:rPr>
+        <w:t xml:space="preserve">Kakao Maps and Naver Maps developer APIs with free tiers for display and directions.</w:t>
+      </w:r>
+    </w:p>
+    <w:p>
+      <w:pPr>
+        <w:pStyle w:val="Heading2"/>
+        <w:spacing w:after="100" w:before="220"/>
+      </w:pPr>
+      <w:r>
+        <w:rPr>
+          <w:b/>
+          <w:bCs/>
+          <w:color w:val="8F2E10"/>
+          <w:sz w:val="24"/>
+          <w:szCs w:val="24"/>
+        </w:rPr>
+        <w:t xml:space="preserve">Booking: manual first, API later</w:t>
+      </w:r>
+    </w:p>
+    <w:p>
+      <w:pPr>
+        <w:pStyle w:val="ListParagraph"/>
+        <w:numPr>
+          <w:ilvl w:val="0"/>
+          <w:numId w:val="2"/>
+        </w:numPr>
+        <w:spacing w:after="70"/>
+      </w:pPr>
+      <w:r>
+        <w:rPr>
+          <w:b/>
+          <w:bCs/>
+          <w:color w:val="333333"/>
+        </w:rPr>
+        <w:t xml:space="preserve">v1 (concierge): </w:t>
+      </w:r>
+      <w:r>
+        <w:rPr>
+          <w:color w:val="333333"/>
+        </w:rPr>
+        <w:t xml:space="preserve">5–10 partner clinics in one migrant-dense city (Ansan). User taps Book; K’Helper relays the request to the clinic by KakaoTalk or phone. No integration required.</w:t>
+      </w:r>
+    </w:p>
+    <w:p>
+      <w:pPr>
+        <w:pStyle w:val="ListParagraph"/>
+        <w:numPr>
+          <w:ilvl w:val="0"/>
+          <w:numId w:val="2"/>
+        </w:numPr>
+        <w:spacing w:after="70"/>
+      </w:pPr>
+      <w:r>
+        <w:rPr>
+          <w:b/>
+          <w:bCs/>
+          <w:color w:val="333333"/>
+        </w:rPr>
+        <w:t xml:space="preserve">The killer feature — translated pre-intake: </w:t>
+      </w:r>
+      <w:r>
+        <w:rPr>
+          <w:color w:val="333333"/>
+        </w:rPr>
+        <w:t xml:space="preserve">every booking arrives with the patient’s details already in Korean ("male, 34, Cambodian, E-9, stomach pain 3 days, NHIS enrolled"). This removes the clinic’s cost of serving foreign patients — the front-desk confusion that makes them hesitate.</w:t>
+      </w:r>
+    </w:p>
+    <w:p>
+      <w:pPr>
+        <w:pStyle w:val="ListParagraph"/>
+        <w:numPr>
+          <w:ilvl w:val="0"/>
+          <w:numId w:val="2"/>
+        </w:numPr>
+        <w:spacing w:after="70"/>
+      </w:pPr>
+      <w:r>
+        <w:rPr>
+          <w:b/>
+          <w:bCs/>
+          <w:color w:val="333333"/>
+        </w:rPr>
+        <w:t xml:space="preserve">v2 (integrated): </w:t>
+      </w:r>
+      <w:r>
+        <w:rPr>
+          <w:color w:val="333333"/>
+        </w:rPr>
+        <w:t xml:space="preserve">once volume is proven, clinics adopt a simple booking dashboard or API integration — they will want in, because K’Helper is their foreign-patient pipeline.</w:t>
+      </w:r>
+    </w:p>
+    <w:p>
+      <w:pPr>
+        <w:pStyle w:val="Heading2"/>
+        <w:spacing w:after="100" w:before="220"/>
+      </w:pPr>
+      <w:r>
+        <w:rPr>
+          <w:b/>
+          <w:bCs/>
+          <w:color w:val="8F2E10"/>
+          <w:sz w:val="24"/>
+          <w:szCs w:val="24"/>
+        </w:rPr>
+        <w:t xml:space="preserve">Why clinics pay</w:t>
+      </w:r>
+    </w:p>
+    <w:p>
+      <w:pPr>
+        <w:spacing w:after="120"/>
+      </w:pPr>
+      <w:r>
+        <w:rPr>
+          <w:color w:val="333333"/>
+        </w:rPr>
+        <w:t xml:space="preserve">Clinics near industrial zones (Ansan, Hwaseong, Pyeongtaek) sit next to hundreds of thousands of foreign workers they cannot reach or serve efficiently. K’Helper delivers new patients with zero language friction — worth a monthly listing fee or per-booking commission. This makes the B2B model concrete: chat is the trust layer, booking is the transaction layer.</w:t>
+      </w:r>
+    </w:p>
+    <w:p>
+      <w:pPr>
+        <w:pStyle w:val="Heading1"/>
+        <w:spacing w:after="140" w:before="320"/>
+      </w:pPr>
+      <w:r>
+        <w:rPr>
+          <w:b/>
+          <w:bCs/>
+          <w:color w:val="D94E1F"/>
+        </w:rPr>
+        <w:t xml:space="preserve">6. Market (verified July 2026)</w:t>
       </w:r>
     </w:p>
     <w:tbl>
@@ -938,7 +1142,7 @@
           <w:bCs/>
           <w:color w:val="D94E1F"/>
         </w:rPr>
-        <w:t xml:space="preserve">6. Go-to-Market</w:t>
+        <w:t xml:space="preserve">7. Go-to-Market</w:t>
       </w:r>
     </w:p>
     <w:p>
@@ -1170,7 +1374,7 @@
           <w:bCs/>
           <w:color w:val="D94E1F"/>
         </w:rPr>
-        <w:t xml:space="preserve">7. Business Model</w:t>
+        <w:t xml:space="preserve">8. Business Model</w:t>
       </w:r>
     </w:p>
     <w:p>
@@ -1834,7 +2038,7 @@
           <w:bCs/>
           <w:color w:val="D94E1F"/>
         </w:rPr>
-        <w:t xml:space="preserve">8. Competition</w:t>
+        <w:t xml:space="preserve">9. Competition</w:t>
       </w:r>
     </w:p>
     <w:p>
@@ -1859,7 +2063,7 @@
           <w:bCs/>
           <w:color w:val="D94E1F"/>
         </w:rPr>
-        <w:t xml:space="preserve">9. Roadmap</w:t>
+        <w:t xml:space="preserve">10. Roadmap</w:t>
       </w:r>
     </w:p>
     <w:tbl>
@@ -2369,7 +2573,7 @@
           <w:bCs/>
           <w:color w:val="D94E1F"/>
         </w:rPr>
-        <w:t xml:space="preserve">10. Costs &amp; Runway</w:t>
+        <w:t xml:space="preserve">11. Costs &amp; Runway</w:t>
       </w:r>
     </w:p>
     <w:p>
@@ -2455,7 +2659,7 @@
           <w:bCs/>
           <w:color w:val="D94E1F"/>
         </w:rPr>
-        <w:t xml:space="preserve">11. Risks</w:t>
+        <w:t xml:space="preserve">12. Risks</w:t>
       </w:r>
     </w:p>
     <w:p>
@@ -2565,7 +2769,7 @@
           <w:bCs/>
           <w:color w:val="D94E1F"/>
         </w:rPr>
-        <w:t xml:space="preserve">12. Priorities Right Now</w:t>
+        <w:t xml:space="preserve">13. Priorities Right Now</w:t>
       </w:r>
     </w:p>
     <w:p>

</xml_diff>

<commit_message>
Honest competition: name INMEDIC, imdr et al; position on AI-first, whole-life, underserved migrants
- Replace false 'no one does this' claim in plan + one-pager
- Add direct-competitor list and INMEDIC/imdr vs K'Helper comparison table
- Reframe moat around serving uninsured migrants human-interpreter apps can't afford to reach

Co-Authored-By: Claude Fable 5 <noreply@anthropic.com>
</commit_message>
<xml_diff>
--- a/K_helper_Business_Plan_2026.docx
+++ b/K_helper_Business_Plan_2026.docx
@@ -266,7 +266,7 @@
         <w:rPr>
           <w:color w:val="333333"/>
         </w:rPr>
-        <w:t xml:space="preserve">Google Translate (unreliable for medical/legal nuance), hospital interpreters (5–10% coverage in the languages that matter most), professional interpreters (unaffordable), Korean-only telemedicine, and Facebook peer groups (trust without expertise). No one offers AI-powered, migrant-specific life navigation. The moat is community trust, migrant-specific depth, and a cost structure incumbents cannot match.</w:t>
+        <w:t xml:space="preserve">Foreigner-health apps exist — INMEDIC and imdr are direct competitors offering hospital discovery, human interpretation, and insurance-claim help. But their human-interpreter model is expensive and naturally serves insured and medical-tourism patients. K’Helper is AI-first (instant, free, any language), spans the whole of life in Korea (not just medical transactions), and targets the uninsured low-income migrant workers they leave behind. The moat is community trust, migrant-specific depth, and a cost structure incumbents cannot match.</w:t>
       </w:r>
     </w:p>
     <w:p>
@@ -2049,7 +2049,609 @@
         <w:rPr>
           <w:color w:val="333333"/>
         </w:rPr>
-        <w:t xml:space="preserve">Google Translate (unreliable for medical/legal), hospital interpreter services (scarce), professional interpreters (unaffordable), Korean-only telemedicine apps, and peer Facebook groups (no expertise). No competitor offers an AI-powered, multilingual life-navigation assistant for foreigners in Korea. K'Helper's moats: community trust, safety-first design, and a cost structure near zero.</w:t>
+        <w:t xml:space="preserve">Foreigner-healthcare apps exist in Korea, and two are direct competitors. We win not by doing the same thing, but by serving a different user and a broader need.</w:t>
+      </w:r>
+    </w:p>
+    <w:p>
+      <w:pPr>
+        <w:pStyle w:val="Heading2"/>
+        <w:spacing w:after="100" w:before="220"/>
+      </w:pPr>
+      <w:r>
+        <w:rPr>
+          <w:b/>
+          <w:bCs/>
+          <w:color w:val="8F2E10"/>
+          <w:sz w:val="24"/>
+          <w:szCs w:val="24"/>
+        </w:rPr>
+        <w:t xml:space="preserve">Direct competitors</w:t>
+      </w:r>
+    </w:p>
+    <w:p>
+      <w:pPr>
+        <w:pStyle w:val="ListParagraph"/>
+        <w:numPr>
+          <w:ilvl w:val="0"/>
+          <w:numId w:val="2"/>
+        </w:numPr>
+        <w:spacing w:after="70"/>
+      </w:pPr>
+      <w:r>
+        <w:rPr>
+          <w:b/>
+          <w:bCs/>
+          <w:color w:val="333333"/>
+        </w:rPr>
+        <w:t xml:space="preserve">INMEDIC: </w:t>
+      </w:r>
+      <w:r>
+        <w:rPr>
+          <w:color w:val="333333"/>
+        </w:rPr>
+        <w:t xml:space="preserve">hospital discovery, real-time human medical interpretation, and insurance-claim help; 12-language, symptom-based hospital guidance. The closest product to our health features.</w:t>
+      </w:r>
+    </w:p>
+    <w:p>
+      <w:pPr>
+        <w:pStyle w:val="ListParagraph"/>
+        <w:numPr>
+          <w:ilvl w:val="0"/>
+          <w:numId w:val="2"/>
+        </w:numPr>
+        <w:spacing w:after="70"/>
+      </w:pPr>
+      <w:r>
+        <w:rPr>
+          <w:b/>
+          <w:bCs/>
+          <w:color w:val="333333"/>
+        </w:rPr>
+        <w:t xml:space="preserve">imdr: </w:t>
+      </w:r>
+      <w:r>
+        <w:rPr>
+          <w:color w:val="333333"/>
+        </w:rPr>
+        <w:t xml:space="preserve">a 7-language O2O platform — self-diagnosis, hospital reservation, human interpretation, insurance claims, and health records; leans toward medical-tourism concierge.</w:t>
+      </w:r>
+    </w:p>
+    <w:p>
+      <w:pPr>
+        <w:pStyle w:val="ListParagraph"/>
+        <w:numPr>
+          <w:ilvl w:val="0"/>
+          <w:numId w:val="2"/>
+        </w:numPr>
+        <w:spacing w:after="70"/>
+      </w:pPr>
+      <w:r>
+        <w:rPr>
+          <w:b/>
+          <w:bCs/>
+          <w:color w:val="333333"/>
+        </w:rPr>
+        <w:t xml:space="preserve">Doctor’s Note / MediTrans: </w:t>
+      </w:r>
+      <w:r>
+        <w:rPr>
+          <w:color w:val="333333"/>
+        </w:rPr>
+        <w:t xml:space="preserve">document-side — translating medical records, certificates, and reports for insurance and visa use.</w:t>
+      </w:r>
+    </w:p>
+    <w:p>
+      <w:pPr>
+        <w:pStyle w:val="ListParagraph"/>
+        <w:numPr>
+          <w:ilvl w:val="0"/>
+          <w:numId w:val="2"/>
+        </w:numPr>
+        <w:spacing w:after="70"/>
+      </w:pPr>
+      <w:r>
+        <w:rPr>
+          <w:b/>
+          <w:bCs/>
+          <w:color w:val="333333"/>
+        </w:rPr>
+        <w:t xml:space="preserve">Invoice-translation tools: </w:t>
+      </w:r>
+      <w:r>
+        <w:rPr>
+          <w:color w:val="333333"/>
+        </w:rPr>
+        <w:t xml:space="preserve">niche services that translate Korean medical bills into English for claims.</w:t>
+      </w:r>
+    </w:p>
+    <w:p>
+      <w:pPr>
+        <w:pStyle w:val="Heading2"/>
+        <w:spacing w:after="100" w:before="220"/>
+      </w:pPr>
+      <w:r>
+        <w:rPr>
+          <w:b/>
+          <w:bCs/>
+          <w:color w:val="8F2E10"/>
+          <w:sz w:val="24"/>
+          <w:szCs w:val="24"/>
+        </w:rPr>
+        <w:t xml:space="preserve">How K’Helper is different</w:t>
+      </w:r>
+    </w:p>
+    <w:tbl>
+      <w:tblPr>
+        <w:tblW w:type="dxa" w:w="9360"/>
+        <w:tblBorders>
+          <w:top w:val="single" w:color="E0C5B0" w:sz="4"/>
+          <w:left w:val="single" w:color="E0C5B0" w:sz="4"/>
+          <w:bottom w:val="single" w:color="E0C5B0" w:sz="4"/>
+          <w:right w:val="single" w:color="E0C5B0" w:sz="4"/>
+          <w:insideH w:val="single" w:color="EFDDCF" w:sz="4"/>
+          <w:insideV w:val="single" w:color="EFDDCF" w:sz="4"/>
+        </w:tblBorders>
+      </w:tblPr>
+      <w:tblGrid>
+        <w:gridCol w:w="1900"/>
+        <w:gridCol w:w="3730"/>
+        <w:gridCol w:w="3730"/>
+      </w:tblGrid>
+      <w:tr>
+        <w:trPr>
+          <w:tblHeader/>
+        </w:trPr>
+        <w:tc>
+          <w:tcPr>
+            <w:tcW w:type="dxa" w:w="1900"/>
+            <w:shd w:fill="F8DCCD" w:val="clear"/>
+            <w:tcMar>
+              <w:top w:type="dxa" w:w="60"/>
+              <w:left w:type="dxa" w:w="100"/>
+              <w:bottom w:type="dxa" w:w="60"/>
+              <w:right w:type="dxa" w:w="100"/>
+            </w:tcMar>
+          </w:tcPr>
+          <w:p>
+            <w:r>
+              <w:rPr>
+                <w:b/>
+                <w:bCs/>
+                <w:color w:val="8F2E10"/>
+                <w:sz w:val="18"/>
+                <w:szCs w:val="18"/>
+              </w:rPr>
+              <w:t xml:space="preserve"/>
+            </w:r>
+          </w:p>
+        </w:tc>
+        <w:tc>
+          <w:tcPr>
+            <w:tcW w:type="dxa" w:w="3730"/>
+            <w:shd w:fill="F8DCCD" w:val="clear"/>
+            <w:tcMar>
+              <w:top w:type="dxa" w:w="60"/>
+              <w:left w:type="dxa" w:w="100"/>
+              <w:bottom w:type="dxa" w:w="60"/>
+              <w:right w:type="dxa" w:w="100"/>
+            </w:tcMar>
+          </w:tcPr>
+          <w:p>
+            <w:r>
+              <w:rPr>
+                <w:b/>
+                <w:bCs/>
+                <w:color w:val="8F2E10"/>
+                <w:sz w:val="18"/>
+                <w:szCs w:val="18"/>
+              </w:rPr>
+              <w:t xml:space="preserve">INMEDIC / imdr</w:t>
+            </w:r>
+          </w:p>
+        </w:tc>
+        <w:tc>
+          <w:tcPr>
+            <w:tcW w:type="dxa" w:w="3730"/>
+            <w:shd w:fill="F8DCCD" w:val="clear"/>
+            <w:tcMar>
+              <w:top w:type="dxa" w:w="60"/>
+              <w:left w:type="dxa" w:w="100"/>
+              <w:bottom w:type="dxa" w:w="60"/>
+              <w:right w:type="dxa" w:w="100"/>
+            </w:tcMar>
+          </w:tcPr>
+          <w:p>
+            <w:r>
+              <w:rPr>
+                <w:b/>
+                <w:bCs/>
+                <w:color w:val="8F2E10"/>
+                <w:sz w:val="18"/>
+                <w:szCs w:val="18"/>
+              </w:rPr>
+              <w:t xml:space="preserve">K’Helper</w:t>
+            </w:r>
+          </w:p>
+        </w:tc>
+      </w:tr>
+      <w:tr>
+        <w:tc>
+          <w:tcPr>
+            <w:tcW w:type="dxa" w:w="1900"/>
+            <w:tcMar>
+              <w:top w:type="dxa" w:w="60"/>
+              <w:left w:type="dxa" w:w="100"/>
+              <w:bottom w:type="dxa" w:w="60"/>
+              <w:right w:type="dxa" w:w="100"/>
+            </w:tcMar>
+          </w:tcPr>
+          <w:p>
+            <w:r>
+              <w:rPr>
+                <w:b w:val="false"/>
+                <w:bCs w:val="false"/>
+                <w:color w:val="333333"/>
+                <w:sz w:val="18"/>
+                <w:szCs w:val="18"/>
+              </w:rPr>
+              <w:t xml:space="preserve">Interpretation</w:t>
+            </w:r>
+          </w:p>
+        </w:tc>
+        <w:tc>
+          <w:tcPr>
+            <w:tcW w:type="dxa" w:w="3730"/>
+            <w:tcMar>
+              <w:top w:type="dxa" w:w="60"/>
+              <w:left w:type="dxa" w:w="100"/>
+              <w:bottom w:type="dxa" w:w="60"/>
+              <w:right w:type="dxa" w:w="100"/>
+            </w:tcMar>
+          </w:tcPr>
+          <w:p>
+            <w:r>
+              <w:rPr>
+                <w:b w:val="false"/>
+                <w:bCs w:val="false"/>
+                <w:color w:val="333333"/>
+                <w:sz w:val="18"/>
+                <w:szCs w:val="18"/>
+              </w:rPr>
+              <w:t xml:space="preserve">Human interpreters — paid, scheduled, business hours</w:t>
+            </w:r>
+          </w:p>
+        </w:tc>
+        <w:tc>
+          <w:tcPr>
+            <w:tcW w:type="dxa" w:w="3730"/>
+            <w:tcMar>
+              <w:top w:type="dxa" w:w="60"/>
+              <w:left w:type="dxa" w:w="100"/>
+              <w:bottom w:type="dxa" w:w="60"/>
+              <w:right w:type="dxa" w:w="100"/>
+            </w:tcMar>
+          </w:tcPr>
+          <w:p>
+            <w:r>
+              <w:rPr>
+                <w:b w:val="false"/>
+                <w:bCs w:val="false"/>
+                <w:color w:val="333333"/>
+                <w:sz w:val="18"/>
+                <w:szCs w:val="18"/>
+              </w:rPr>
+              <w:t xml:space="preserve">AI — instant, free, 24/7, any language</w:t>
+            </w:r>
+          </w:p>
+        </w:tc>
+      </w:tr>
+      <w:tr>
+        <w:tc>
+          <w:tcPr>
+            <w:tcW w:type="dxa" w:w="1900"/>
+            <w:tcMar>
+              <w:top w:type="dxa" w:w="60"/>
+              <w:left w:type="dxa" w:w="100"/>
+              <w:bottom w:type="dxa" w:w="60"/>
+              <w:right w:type="dxa" w:w="100"/>
+            </w:tcMar>
+          </w:tcPr>
+          <w:p>
+            <w:r>
+              <w:rPr>
+                <w:b w:val="false"/>
+                <w:bCs w:val="false"/>
+                <w:color w:val="333333"/>
+                <w:sz w:val="18"/>
+                <w:szCs w:val="18"/>
+              </w:rPr>
+              <w:t xml:space="preserve">Scope</w:t>
+            </w:r>
+          </w:p>
+        </w:tc>
+        <w:tc>
+          <w:tcPr>
+            <w:tcW w:type="dxa" w:w="3730"/>
+            <w:tcMar>
+              <w:top w:type="dxa" w:w="60"/>
+              <w:left w:type="dxa" w:w="100"/>
+              <w:bottom w:type="dxa" w:w="60"/>
+              <w:right w:type="dxa" w:w="100"/>
+            </w:tcMar>
+          </w:tcPr>
+          <w:p>
+            <w:r>
+              <w:rPr>
+                <w:b w:val="false"/>
+                <w:bCs w:val="false"/>
+                <w:color w:val="333333"/>
+                <w:sz w:val="18"/>
+                <w:szCs w:val="18"/>
+              </w:rPr>
+              <w:t xml:space="preserve">Medical transactions only</w:t>
+            </w:r>
+          </w:p>
+        </w:tc>
+        <w:tc>
+          <w:tcPr>
+            <w:tcW w:type="dxa" w:w="3730"/>
+            <w:tcMar>
+              <w:top w:type="dxa" w:w="60"/>
+              <w:left w:type="dxa" w:w="100"/>
+              <w:bottom w:type="dxa" w:w="60"/>
+              <w:right w:type="dxa" w:w="100"/>
+            </w:tcMar>
+          </w:tcPr>
+          <w:p>
+            <w:r>
+              <w:rPr>
+                <w:b w:val="false"/>
+                <w:bCs w:val="false"/>
+                <w:color w:val="333333"/>
+                <w:sz w:val="18"/>
+                <w:szCs w:val="18"/>
+              </w:rPr>
+              <w:t xml:space="preserve">Whole life in Korea — health is the wedge, plus visa, work rights, housing</w:t>
+            </w:r>
+          </w:p>
+        </w:tc>
+      </w:tr>
+      <w:tr>
+        <w:tc>
+          <w:tcPr>
+            <w:tcW w:type="dxa" w:w="1900"/>
+            <w:tcMar>
+              <w:top w:type="dxa" w:w="60"/>
+              <w:left w:type="dxa" w:w="100"/>
+              <w:bottom w:type="dxa" w:w="60"/>
+              <w:right w:type="dxa" w:w="100"/>
+            </w:tcMar>
+          </w:tcPr>
+          <w:p>
+            <w:r>
+              <w:rPr>
+                <w:b w:val="false"/>
+                <w:bCs w:val="false"/>
+                <w:color w:val="333333"/>
+                <w:sz w:val="18"/>
+                <w:szCs w:val="18"/>
+              </w:rPr>
+              <w:t xml:space="preserve">Target user</w:t>
+            </w:r>
+          </w:p>
+        </w:tc>
+        <w:tc>
+          <w:tcPr>
+            <w:tcW w:type="dxa" w:w="3730"/>
+            <w:tcMar>
+              <w:top w:type="dxa" w:w="60"/>
+              <w:left w:type="dxa" w:w="100"/>
+              <w:bottom w:type="dxa" w:w="60"/>
+              <w:right w:type="dxa" w:w="100"/>
+            </w:tcMar>
+          </w:tcPr>
+          <w:p>
+            <w:r>
+              <w:rPr>
+                <w:b w:val="false"/>
+                <w:bCs w:val="false"/>
+                <w:color w:val="333333"/>
+                <w:sz w:val="18"/>
+                <w:szCs w:val="18"/>
+              </w:rPr>
+              <w:t xml:space="preserve">Insured / medical-tourism patients</w:t>
+            </w:r>
+          </w:p>
+        </w:tc>
+        <w:tc>
+          <w:tcPr>
+            <w:tcW w:type="dxa" w:w="3730"/>
+            <w:tcMar>
+              <w:top w:type="dxa" w:w="60"/>
+              <w:left w:type="dxa" w:w="100"/>
+              <w:bottom w:type="dxa" w:w="60"/>
+              <w:right w:type="dxa" w:w="100"/>
+            </w:tcMar>
+          </w:tcPr>
+          <w:p>
+            <w:r>
+              <w:rPr>
+                <w:b w:val="false"/>
+                <w:bCs w:val="false"/>
+                <w:color w:val="333333"/>
+                <w:sz w:val="18"/>
+                <w:szCs w:val="18"/>
+              </w:rPr>
+              <w:t xml:space="preserve">Low-income migrant workers — the uninsured, underserved majority</w:t>
+            </w:r>
+          </w:p>
+        </w:tc>
+      </w:tr>
+      <w:tr>
+        <w:tc>
+          <w:tcPr>
+            <w:tcW w:type="dxa" w:w="1900"/>
+            <w:tcMar>
+              <w:top w:type="dxa" w:w="60"/>
+              <w:left w:type="dxa" w:w="100"/>
+              <w:bottom w:type="dxa" w:w="60"/>
+              <w:right w:type="dxa" w:w="100"/>
+            </w:tcMar>
+          </w:tcPr>
+          <w:p>
+            <w:r>
+              <w:rPr>
+                <w:b w:val="false"/>
+                <w:bCs w:val="false"/>
+                <w:color w:val="333333"/>
+                <w:sz w:val="18"/>
+                <w:szCs w:val="18"/>
+              </w:rPr>
+              <w:t xml:space="preserve">Poorest-language depth</w:t>
+            </w:r>
+          </w:p>
+        </w:tc>
+        <w:tc>
+          <w:tcPr>
+            <w:tcW w:type="dxa" w:w="3730"/>
+            <w:tcMar>
+              <w:top w:type="dxa" w:w="60"/>
+              <w:left w:type="dxa" w:w="100"/>
+              <w:bottom w:type="dxa" w:w="60"/>
+              <w:right w:type="dxa" w:w="100"/>
+            </w:tcMar>
+          </w:tcPr>
+          <w:p>
+            <w:r>
+              <w:rPr>
+                <w:b w:val="false"/>
+                <w:bCs w:val="false"/>
+                <w:color w:val="333333"/>
+                <w:sz w:val="18"/>
+                <w:szCs w:val="18"/>
+              </w:rPr>
+              <w:t xml:space="preserve">Weak for Khmer, Bengali (interpreter cost)</w:t>
+            </w:r>
+          </w:p>
+        </w:tc>
+        <w:tc>
+          <w:tcPr>
+            <w:tcW w:type="dxa" w:w="3730"/>
+            <w:tcMar>
+              <w:top w:type="dxa" w:w="60"/>
+              <w:left w:type="dxa" w:w="100"/>
+              <w:bottom w:type="dxa" w:w="60"/>
+              <w:right w:type="dxa" w:w="100"/>
+            </w:tcMar>
+          </w:tcPr>
+          <w:p>
+            <w:r>
+              <w:rPr>
+                <w:b w:val="false"/>
+                <w:bCs w:val="false"/>
+                <w:color w:val="333333"/>
+                <w:sz w:val="18"/>
+                <w:szCs w:val="18"/>
+              </w:rPr>
+              <w:t xml:space="preserve">Strong — AI serves any language at near-zero cost</w:t>
+            </w:r>
+          </w:p>
+        </w:tc>
+      </w:tr>
+      <w:tr>
+        <w:tc>
+          <w:tcPr>
+            <w:tcW w:type="dxa" w:w="1900"/>
+            <w:tcMar>
+              <w:top w:type="dxa" w:w="60"/>
+              <w:left w:type="dxa" w:w="100"/>
+              <w:bottom w:type="dxa" w:w="60"/>
+              <w:right w:type="dxa" w:w="100"/>
+            </w:tcMar>
+          </w:tcPr>
+          <w:p>
+            <w:r>
+              <w:rPr>
+                <w:b w:val="false"/>
+                <w:bCs w:val="false"/>
+                <w:color w:val="333333"/>
+                <w:sz w:val="18"/>
+                <w:szCs w:val="18"/>
+              </w:rPr>
+              <w:t xml:space="preserve">Distribution</w:t>
+            </w:r>
+          </w:p>
+        </w:tc>
+        <w:tc>
+          <w:tcPr>
+            <w:tcW w:type="dxa" w:w="3730"/>
+            <w:tcMar>
+              <w:top w:type="dxa" w:w="60"/>
+              <w:left w:type="dxa" w:w="100"/>
+              <w:bottom w:type="dxa" w:w="60"/>
+              <w:right w:type="dxa" w:w="100"/>
+            </w:tcMar>
+          </w:tcPr>
+          <w:p>
+            <w:r>
+              <w:rPr>
+                <w:b w:val="false"/>
+                <w:bCs w:val="false"/>
+                <w:color w:val="333333"/>
+                <w:sz w:val="18"/>
+                <w:szCs w:val="18"/>
+              </w:rPr>
+              <w:t xml:space="preserve">App-store / B2B2C</w:t>
+            </w:r>
+          </w:p>
+        </w:tc>
+        <w:tc>
+          <w:tcPr>
+            <w:tcW w:type="dxa" w:w="3730"/>
+            <w:tcMar>
+              <w:top w:type="dxa" w:w="60"/>
+              <w:left w:type="dxa" w:w="100"/>
+              <w:bottom w:type="dxa" w:w="60"/>
+              <w:right w:type="dxa" w:w="100"/>
+            </w:tcMar>
+          </w:tcPr>
+          <w:p>
+            <w:r>
+              <w:rPr>
+                <w:b w:val="false"/>
+                <w:bCs w:val="false"/>
+                <w:color w:val="333333"/>
+                <w:sz w:val="18"/>
+                <w:szCs w:val="18"/>
+              </w:rPr>
+              <w:t xml:space="preserve">Community-led, founder embedded in the migrant community</w:t>
+            </w:r>
+          </w:p>
+        </w:tc>
+      </w:tr>
+    </w:tbl>
+    <w:p>
+      <w:pPr>
+        <w:spacing w:after="120"/>
+      </w:pPr>
+      <w:r>
+        <w:rPr>
+          <w:b/>
+          <w:bCs/>
+          <w:color w:val="333333"/>
+        </w:rPr>
+        <w:t xml:space="preserve">Their human-interpreter model is their moat and their ceiling: it is trustworthy but expensive, so it naturally serves higher-value insured and medical-tourism patients. That leaves the largest, most desperate segment — uninsured E-9 workers who cannot pay for an interpreter — underserved. That is our beachhead.</w:t>
+      </w:r>
+    </w:p>
+    <w:p>
+      <w:pPr>
+        <w:spacing w:after="120"/>
+      </w:pPr>
+      <w:r>
+        <w:rPr>
+          <w:color w:val="333333"/>
+        </w:rPr>
+        <w:t xml:space="preserve">Also-rans: Google Translate (unreliable for medical/legal nuance), Korean-only telemedicine, and Facebook peer groups (trust without expertise). Our durable moats: community trust, migrant-specific depth beyond healthcare, and a cost structure incumbents cannot match.</w:t>
       </w:r>
     </w:p>
     <w:p>

</xml_diff>